<commit_message>
Contratto: nuovi termini cancellazione variabili e data fine evento
- Aggiunto campo Event.cancellation_penalty_percent (default 50%)
  visibile nell'admin sotto "Dati per contratti"; migration 0007
- pdf_generator: passa cancellation_penalty_percent nel context Jinja
- template_non_ecm_it.docx: TERMINI DI CANCELLAZIONE sostituiti con
  testo legale completo + variabile {{ cancellation_penalty_percent }}%;
  campo DATA aggiornato con data fine evento
- template_domanda_ammissione_it.docx: stessi aggiornamenti
  (frase "chiede di essere ammessa" ora riporta anche data fine;
  paragrafo termini cancellazione sostituito con testo completo)
- template_ecm_it.docx: campo Data in Allegato 2 aggiornato con
  data fine evento
</commit_message>
<xml_diff>
--- a/contracts/templates_pdf/template_domanda_ammissione_it.docx
+++ b/contracts/templates_pdf/template_domanda_ammissione_it.docx
@@ -625,127 +625,7 @@
           <w:sz w:val="20"/>
           <w:szCs w:val="20"/>
         </w:rPr>
-        <w:t xml:space="preserve">Chiede di essere ammessa a partecipare all'evento </w:t>
-      </w:r>
-      <w:r>
-        <w:rPr>
-          <w:rFonts w:ascii="ArialMT" w:hAnsi="ArialMT" w:cs="ArialMT"/>
-          <w:b/>
-          <w:bCs/>
-          <w:kern w:val="0"/>
-          <w:sz w:val="20"/>
-          <w:szCs w:val="20"/>
-        </w:rPr>
-        <w:t>{{ event.name }}</w:t>
-      </w:r>
-      <w:r>
-        <w:rPr>
-          <w:rFonts w:ascii="ArialMT" w:hAnsi="ArialMT" w:cs="ArialMT"/>
-          <w:kern w:val="0"/>
-          <w:sz w:val="20"/>
-          <w:szCs w:val="20"/>
-        </w:rPr>
-        <w:t xml:space="preserve"> che si svolgerà a </w:t>
-      </w:r>
-      <w:r>
-        <w:rPr>
-          <w:rFonts w:ascii="ArialMT" w:hAnsi="ArialMT" w:cs="ArialMT"/>
-          <w:b/>
-          <w:bCs/>
-          <w:kern w:val="0"/>
-          <w:sz w:val="20"/>
-          <w:szCs w:val="20"/>
-        </w:rPr>
-        <w:t>{{ event.location }}</w:t>
-      </w:r>
-      <w:r>
-        <w:rPr>
-          <w:rFonts w:ascii="Arial-BoldMT" w:hAnsi="Arial-BoldMT" w:cs="Arial-BoldMT"/>
-          <w:b/>
-          <w:bCs/>
-          <w:kern w:val="0"/>
-          <w:sz w:val="20"/>
-          <w:szCs w:val="20"/>
-        </w:rPr>
-        <w:t>, p</w:t>
-      </w:r>
-      <w:r>
-        <w:rPr>
-          <w:rFonts w:ascii="ArialMT" w:hAnsi="ArialMT" w:cs="ArialMT"/>
-          <w:kern w:val="0"/>
-          <w:sz w:val="20"/>
-          <w:szCs w:val="20"/>
-        </w:rPr>
-        <w:t xml:space="preserve">resso </w:t>
-      </w:r>
-      <w:r>
-        <w:rPr>
-          <w:rFonts w:ascii="Arial" w:hAnsi="Arial" w:cs="Arial"/>
-          <w:kern w:val="0"/>
-          <w:sz w:val="20"/>
-          <w:szCs w:val="20"/>
-        </w:rPr>
-        <w:t>i</w:t>
-      </w:r>
-      <w:r>
-        <w:rPr>
-          <w:rFonts w:ascii="ArialMT" w:hAnsi="ArialMT" w:cs="ArialMT"/>
-          <w:kern w:val="0"/>
-          <w:sz w:val="20"/>
-          <w:szCs w:val="20"/>
-        </w:rPr>
-        <w:t xml:space="preserve">l </w:t>
-      </w:r>
-      <w:r>
-        <w:rPr>
-          <w:rFonts w:ascii="ArialMT" w:hAnsi="ArialMT" w:cs="ArialMT"/>
-          <w:b/>
-          <w:bCs/>
-          <w:kern w:val="0"/>
-          <w:sz w:val="20"/>
-          <w:szCs w:val="20"/>
-        </w:rPr>
-        <w:t>{{ event.venue_name|default(event.venue_address, true) }}</w:t>
-      </w:r>
-      <w:r>
-        <w:rPr>
-          <w:rFonts w:ascii="ArialMT" w:hAnsi="ArialMT" w:cs="ArialMT"/>
-          <w:kern w:val="0"/>
-          <w:sz w:val="20"/>
-          <w:szCs w:val="20"/>
-        </w:rPr>
-        <w:t xml:space="preserve"> </w:t>
-      </w:r>
-      <w:r>
-        <w:rPr>
-          <w:rFonts w:ascii="Arial" w:hAnsi="Arial" w:cs="Arial"/>
-          <w:kern w:val="0"/>
-          <w:sz w:val="20"/>
-          <w:szCs w:val="20"/>
-        </w:rPr>
-        <w:t xml:space="preserve">il </w:t>
-      </w:r>
-      <w:r>
-        <w:rPr>
-          <w:rFonts w:ascii="Arial" w:hAnsi="Arial" w:cs="Arial"/>
-          <w:b/>
-          <w:bCs/>
-          <w:kern w:val="0"/>
-          <w:sz w:val="20"/>
-          <w:szCs w:val="20"/>
-        </w:rPr>
-        <w:t>{{ event.start_date|format_date }}</w:t>
-      </w:r>
-      <w:r>
-        <w:rPr>
-          <w:rFonts w:ascii="Arial,Bold" w:hAnsi="Arial,Bold" w:cs="Arial,Bold"/>
-          <w:b/>
-          <w:bCs/>
-          <w:kern w:val="0"/>
-          <w:sz w:val="20"/>
-          <w:szCs w:val="20"/>
-        </w:rPr>
-        <w:t>.</w:t>
+        <w:t>Chiede di essere ammessa a partecipare all'evento {{ event.name }} che si svolgerà a {{ event.location }}, presso il {{ event.venue_name|default(event.venue_address, true) }} il {{ event.start_date|format_date }} – {{ event.end_date|format_date }}.</w:t>
       </w:r>
     </w:p>
     <w:p>
@@ -1741,15 +1621,7 @@
           <w:sz w:val="20"/>
           <w:szCs w:val="20"/>
         </w:rPr>
-        <w:t xml:space="preserve">Termini di cancellazione: </w:t>
-      </w:r>
-      <w:r>
-        <w:rPr>
-          <w:rFonts w:ascii="Calibri" w:hAnsi="Calibri" w:cs="Calibri"/>
-          <w:sz w:val="20"/>
-          <w:szCs w:val="20"/>
-        </w:rPr>
-        <w:t>Dalla data di conferma a 30 giorni prima dell’evento verrà restituito il 50% compenso concordato; da 29 giorni prima dell’evento in poi, verrà trattenuto l’intero compenso</w:t>
+        <w:t>Termini di cancellazione: La rinuncia (e/o le variazioni e/o le cancellazioni totali e/o parziali della prenotazione) dell'Espositore a partecipare alla Manifestazione, per qualsiasi motivo, dovrà essere comunicata a mezzo di lettera raccomandata A/R o PEC indirizzata all'Organizzatore almeno 30 giorni prima dell'inizio della Manifestazione. In tal caso l'Organizzatore ha diritto di trattenere, a titolo di penale, una somma pari al {{ cancellation_penalty_percent }}% dell'importo totale del presente contratto (corrispondente al deposito cauzionale/caparra). Nel caso in cui la rinuncia pervenga successivamente al 30° giorno antecedente l'inizio della Manifestazione l'Espositore sarà tenuto al pagamento integrale del corrispettivo del presente contratto.</w:t>
       </w:r>
     </w:p>
     <w:p>

</xml_diff>

<commit_message>
Contratto: fix percentuale cancellazione nel contesto domanda ammissione + titolo MAIUSCOLO BOLD
</commit_message>
<xml_diff>
--- a/contracts/templates_pdf/template_domanda_ammissione_it.docx
+++ b/contracts/templates_pdf/template_domanda_ammissione_it.docx
@@ -1615,13 +1615,16 @@
       </w:pPr>
       <w:r>
         <w:rPr>
-          <w:rFonts w:eastAsia="Calibri" w:cstheme="minorHAnsi"/>
           <w:b/>
-          <w:bCs/>
-          <w:sz w:val="20"/>
-          <w:szCs w:val="20"/>
-        </w:rPr>
-        <w:t>Termini di cancellazione: La rinuncia (e/o le variazioni e/o le cancellazioni totali e/o parziali della prenotazione) dell'Espositore a partecipare alla Manifestazione, per qualsiasi motivo, dovrà essere comunicata a mezzo di lettera raccomandata A/R o PEC indirizzata all'Organizzatore almeno 30 giorni prima dell'inizio della Manifestazione. In tal caso l'Organizzatore ha diritto di trattenere, a titolo di penale, una somma pari al {{ cancellation_penalty_percent }}% dell'importo totale del presente contratto (corrispondente al deposito cauzionale/caparra). Nel caso in cui la rinuncia pervenga successivamente al 30° giorno antecedente l'inizio della Manifestazione l'Espositore sarà tenuto al pagamento integrale del corrispettivo del presente contratto.</w:t>
+        </w:rPr>
+        <w:t>TERMINI DI CANCELLAZIONE</w:t>
+      </w:r>
+      <w:r>
+        <w:rPr>
+          <w:b w:val="0"/>
+        </w:rPr>
+        <w:br/>
+        <w:t>La rinuncia (e/o le variazioni e/o le cancellazioni totali e/o parziali della prenotazione) dell'Espositore a partecipare alla Manifestazione, per qualsiasi motivo, dovrà essere comunicata a mezzo di lettera raccomandata A/R o PEC indirizzata all'Organizzatore almeno 30 giorni prima dell'inizio della Manifestazione. In tal caso l'Organizzatore ha diritto di trattenere, a titolo di penale, una somma pari al {{ cancellation_penalty_percent }}% dell'importo totale del presente contratto (corrispondente al deposito cauzionale/caparra). Nel caso in cui la rinuncia pervenga successivamente al 30° giorno antecedente l'inizio della Manifestazione l'Espositore sarà tenuto al pagamento integrale del corrispettivo del presente contratto.</w:t>
       </w:r>
     </w:p>
     <w:p>

</xml_diff>

<commit_message>
Preventivo email solo testo, sblocco stand su cancellazione, pagamento condizionale domanda ammissione
1) Email preventivo (IT/EN): rimosso l'elenco righe/totali inline; ora
   e' solo testo di accompagnamento, i dettagli restano nel PDF allegato.

2) Cancellazione preventivo libera lo stand/blocco: Contract.delete()
   (soft-delete) ora richiama update_status_from_contract; ContractAdmin
   override delete_model/delete_queryset per la cancellazione singola e
   multipla. I servizi a numero limitato erano gia' liberati da soli.

3) Domanda di ammissione, blocco pagamento condizionale su has_deposit:
   - acconto+saldo: DEPOSITO CAUZIONALE + SALDO + ATTENZIONE, penale = % caparra
   - pagamento unico/differito: solo voce SALDO, niente ATTENZIONE, penale = % evento
   - TERMINI DI CANCELLAZIONE allineato a sinistra
   - penale_percent calcolato in pdf_generator (caparra o % evento)
</commit_message>
<xml_diff>
--- a/contracts/templates_pdf/template_domanda_ammissione_it.docx
+++ b/contracts/templates_pdf/template_domanda_ammissione_it.docx
@@ -1479,7 +1479,7 @@
           <w:sz w:val="20"/>
           <w:szCs w:val="20"/>
         </w:rPr>
-        <w:t>DEPOSITO CAUZIONALE: €</w:t>
+        <w:t>{% if has_deposit %}DEPOSITO CAUZIONALE: €</w:t>
       </w:r>
       <w:r>
         <w:rPr>
@@ -1531,7 +1531,7 @@
           <w:sz w:val="20"/>
           <w:szCs w:val="20"/>
         </w:rPr>
-        <w:t>SALDO: €</w:t>
+        <w:t>{% endif %}SALDO: €</w:t>
       </w:r>
       <w:r>
         <w:rPr>
@@ -1573,6 +1573,11 @@
       </w:r>
     </w:p>
     <w:p>
+      <w:r>
+        <w:t>{%p if has_deposit %}</w:t>
+      </w:r>
+    </w:p>
+    <w:p>
       <w:pPr>
         <w:adjustRightInd w:val="0"/>
         <w:spacing w:after="0" w:line="240" w:lineRule="auto"/>
@@ -1603,10 +1608,15 @@
       </w:r>
     </w:p>
     <w:p>
+      <w:r>
+        <w:t>{%p endif %}</w:t>
+      </w:r>
+    </w:p>
+    <w:p>
       <w:pPr>
         <w:adjustRightInd w:val="0"/>
         <w:spacing w:after="0" w:line="240" w:lineRule="auto"/>
-        <w:jc w:val="both"/>
+        <w:jc w:val="left"/>
         <w:rPr>
           <w:noProof/>
           <w:sz w:val="20"/>
@@ -1624,7 +1634,7 @@
           <w:b w:val="0"/>
         </w:rPr>
         <w:br/>
-        <w:t>La rinuncia (e/o le variazioni e/o le cancellazioni totali e/o parziali della prenotazione) dell'Espositore a partecipare alla Manifestazione, per qualsiasi motivo, dovrà essere comunicata a mezzo di lettera raccomandata A/R o PEC indirizzata all'Organizzatore almeno 30 giorni prima dell'inizio della Manifestazione. In tal caso l'Organizzatore ha diritto di trattenere, a titolo di penale, una somma pari al {{ cancellation_penalty_percent }}% dell'importo totale del presente contratto (corrispondente al deposito cauzionale/caparra). Nel caso in cui la rinuncia pervenga successivamente al 30° giorno antecedente l'inizio della Manifestazione l'Espositore sarà tenuto al pagamento integrale del corrispettivo del presente contratto.</w:t>
+        <w:t>La rinuncia (e/o le variazioni e/o le cancellazioni totali e/o parziali della prenotazione) dell'Espositore a partecipare alla Manifestazione, per qualsiasi motivo, dovrà essere comunicata a mezzo di lettera raccomandata A/R o PEC indirizzata all'Organizzatore almeno 30 giorni prima dell'inizio della Manifestazione. In tal caso l'Organizzatore ha diritto di trattenere, a titolo di penale, una somma pari al {{ penale_percent }}% dell'importo totale del presente contratto (corrispondente al deposito cauzionale/caparra). Nel caso in cui la rinuncia pervenga successivamente al 30° giorno antecedente l'inizio della Manifestazione l'Espositore sarà tenuto al pagamento integrale del corrispettivo del presente contratto.</w:t>
       </w:r>
     </w:p>
     <w:p>

</xml_diff>

<commit_message>
Domanda ammissione: font uniforme (Arial) e paragrafi di testo giustificati
</commit_message>
<xml_diff>
--- a/contracts/templates_pdf/template_domanda_ammissione_it.docx
+++ b/contracts/templates_pdf/template_domanda_ammissione_it.docx
@@ -15,6 +15,7 @@
       </w:pPr>
       <w:r>
         <w:rPr>
+          <w:rFonts w:ascii="Arial" w:hAnsi="Arial" w:cs="Arial"/>
           <w:b/>
           <w:bCs/>
           <w:color w:val="1F3864" w:themeColor="accent1" w:themeShade="80"/>
@@ -53,6 +54,7 @@
             </w:pPr>
             <w:r>
               <w:rPr>
+                <w:rFonts w:ascii="Arial" w:hAnsi="Arial" w:cs="Arial"/>
                 <w:b/>
                 <w:bCs/>
               </w:rPr>
@@ -74,6 +76,7 @@
             </w:pPr>
             <w:r>
               <w:rPr>
+                <w:rFonts w:ascii="Arial" w:hAnsi="Arial" w:cs="Arial"/>
                 <w:b/>
                 <w:bCs/>
               </w:rPr>
@@ -97,6 +100,7 @@
             </w:pPr>
             <w:r>
               <w:rPr>
+                <w:rFonts w:ascii="Arial" w:hAnsi="Arial" w:cs="Arial"/>
                 <w:b/>
                 <w:bCs/>
               </w:rPr>
@@ -118,6 +122,7 @@
             </w:pPr>
             <w:r>
               <w:rPr>
+                <w:rFonts w:ascii="Arial" w:hAnsi="Arial" w:cs="Arial"/>
                 <w:b/>
                 <w:bCs/>
               </w:rPr>
@@ -141,6 +146,7 @@
             </w:pPr>
             <w:r>
               <w:rPr>
+                <w:rFonts w:ascii="Arial" w:hAnsi="Arial" w:cs="Arial"/>
                 <w:b/>
                 <w:bCs/>
               </w:rPr>
@@ -162,6 +168,7 @@
             </w:pPr>
             <w:r>
               <w:rPr>
+                <w:rFonts w:ascii="Arial" w:hAnsi="Arial" w:cs="Arial"/>
                 <w:b/>
                 <w:bCs/>
               </w:rPr>
@@ -182,6 +189,7 @@
             </w:pPr>
             <w:r>
               <w:rPr>
+                <w:rFonts w:ascii="Arial" w:hAnsi="Arial" w:cs="Arial"/>
                 <w:b/>
                 <w:bCs/>
               </w:rPr>
@@ -202,6 +210,7 @@
             </w:pPr>
             <w:r>
               <w:rPr>
+                <w:rFonts w:ascii="Arial" w:hAnsi="Arial" w:cs="Arial"/>
                 <w:b/>
                 <w:bCs/>
               </w:rPr>
@@ -225,6 +234,7 @@
             </w:pPr>
             <w:r>
               <w:rPr>
+                <w:rFonts w:ascii="Arial" w:hAnsi="Arial" w:cs="Arial"/>
                 <w:b/>
                 <w:bCs/>
               </w:rPr>
@@ -247,6 +257,7 @@
             </w:pPr>
             <w:r>
               <w:rPr>
+                <w:rFonts w:ascii="Arial" w:hAnsi="Arial" w:cs="Arial"/>
                 <w:b/>
                 <w:bCs/>
               </w:rPr>
@@ -267,6 +278,7 @@
             </w:pPr>
             <w:r>
               <w:rPr>
+                <w:rFonts w:ascii="Arial" w:hAnsi="Arial" w:cs="Arial"/>
                 <w:b/>
                 <w:bCs/>
               </w:rPr>
@@ -288,6 +300,7 @@
             </w:pPr>
             <w:r>
               <w:rPr>
+                <w:rFonts w:ascii="Arial" w:hAnsi="Arial" w:cs="Arial"/>
                 <w:b/>
                 <w:bCs/>
               </w:rPr>
@@ -311,6 +324,7 @@
             </w:pPr>
             <w:r>
               <w:rPr>
+                <w:rFonts w:ascii="Arial" w:hAnsi="Arial" w:cs="Arial"/>
                 <w:b/>
                 <w:bCs/>
               </w:rPr>
@@ -332,6 +346,7 @@
             </w:pPr>
             <w:r>
               <w:rPr>
+                <w:rFonts w:ascii="Arial" w:hAnsi="Arial" w:cs="Arial"/>
                 <w:b/>
                 <w:bCs/>
               </w:rPr>
@@ -352,6 +367,7 @@
             </w:pPr>
             <w:r>
               <w:rPr>
+                <w:rFonts w:ascii="Arial" w:hAnsi="Arial" w:cs="Arial"/>
                 <w:b/>
                 <w:bCs/>
               </w:rPr>
@@ -373,6 +389,7 @@
             </w:pPr>
             <w:r>
               <w:rPr>
+                <w:rFonts w:ascii="Arial" w:hAnsi="Arial" w:cs="Arial"/>
                 <w:b/>
                 <w:bCs/>
               </w:rPr>
@@ -396,6 +413,7 @@
             </w:pPr>
             <w:r>
               <w:rPr>
+                <w:rFonts w:ascii="Arial" w:hAnsi="Arial" w:cs="Arial"/>
                 <w:b/>
                 <w:bCs/>
               </w:rPr>
@@ -416,6 +434,7 @@
             </w:pPr>
             <w:r>
               <w:rPr>
+                <w:rFonts w:ascii="Arial" w:hAnsi="Arial" w:cs="Arial"/>
                 <w:b/>
                 <w:bCs/>
               </w:rPr>
@@ -436,6 +455,7 @@
             </w:pPr>
             <w:r>
               <w:rPr>
+                <w:rFonts w:ascii="Arial" w:hAnsi="Arial" w:cs="Arial"/>
                 <w:b/>
                 <w:bCs/>
               </w:rPr>
@@ -457,6 +477,7 @@
             </w:pPr>
             <w:r>
               <w:rPr>
+                <w:rFonts w:ascii="Arial" w:hAnsi="Arial" w:cs="Arial"/>
                 <w:b/>
                 <w:bCs/>
               </w:rPr>
@@ -480,6 +501,7 @@
             </w:pPr>
             <w:r>
               <w:rPr>
+                <w:rFonts w:ascii="Arial" w:hAnsi="Arial" w:cs="Arial"/>
                 <w:b/>
                 <w:bCs/>
               </w:rPr>
@@ -500,6 +522,7 @@
             </w:pPr>
             <w:r>
               <w:rPr>
+                <w:rFonts w:ascii="Arial" w:hAnsi="Arial" w:cs="Arial"/>
                 <w:b/>
                 <w:bCs/>
               </w:rPr>
@@ -520,6 +543,7 @@
             </w:pPr>
             <w:r>
               <w:rPr>
+                <w:rFonts w:ascii="Arial" w:hAnsi="Arial" w:cs="Arial"/>
                 <w:b/>
                 <w:bCs/>
               </w:rPr>
@@ -541,6 +565,7 @@
             </w:pPr>
             <w:r>
               <w:rPr>
+                <w:rFonts w:ascii="Arial" w:hAnsi="Arial" w:cs="Arial"/>
                 <w:b/>
                 <w:bCs/>
               </w:rPr>
@@ -560,6 +585,7 @@
       </w:pPr>
       <w:r>
         <w:rPr>
+          <w:rFonts w:ascii="Arial" w:hAnsi="Arial" w:cs="Arial"/>
           <w:b/>
           <w:bCs/>
         </w:rPr>
@@ -593,6 +619,7 @@
             </w:pPr>
             <w:r>
               <w:rPr>
+                <w:rFonts w:ascii="Arial" w:hAnsi="Arial" w:cs="Arial"/>
                 <w:b/>
                 <w:bCs/>
               </w:rPr>
@@ -620,7 +647,7 @@
       </w:pPr>
       <w:r>
         <w:rPr>
-          <w:rFonts w:ascii="ArialMT" w:hAnsi="ArialMT" w:cs="ArialMT"/>
+          <w:rFonts w:ascii="Arial" w:hAnsi="Arial" w:cs="Arial"/>
           <w:kern w:val="0"/>
           <w:sz w:val="20"/>
           <w:szCs w:val="20"/>
@@ -644,7 +671,7 @@
       </w:pPr>
       <w:r>
         <w:rPr>
-          <w:rFonts w:ascii="Arial,Bold" w:hAnsi="Arial,Bold" w:cs="Arial,Bold"/>
+          <w:rFonts w:ascii="Arial" w:hAnsi="Arial" w:cs="Arial"/>
           <w:kern w:val="0"/>
           <w:sz w:val="20"/>
           <w:szCs w:val="20"/>
@@ -668,7 +695,7 @@
       </w:pPr>
       <w:r>
         <w:rPr>
-          <w:rFonts w:ascii="Arial,Bold" w:hAnsi="Arial,Bold" w:cs="Arial,Bold"/>
+          <w:rFonts w:ascii="Arial" w:hAnsi="Arial" w:cs="Arial"/>
           <w:kern w:val="0"/>
           <w:sz w:val="20"/>
           <w:szCs w:val="20"/>
@@ -725,7 +752,7 @@
             </w:pPr>
             <w:r>
               <w:rPr>
-                <w:rFonts w:ascii="ArialMT" w:hAnsi="ArialMT" w:cs="ArialMT"/>
+                <w:rFonts w:ascii="Arial" w:hAnsi="Arial" w:cs="Arial"/>
                 <w:b/>
                 <w:bCs/>
                 <w:kern w:val="0"/>
@@ -757,7 +784,7 @@
             </w:pPr>
             <w:r>
               <w:rPr>
-                <w:rFonts w:ascii="ArialMT" w:hAnsi="ArialMT" w:cs="ArialMT"/>
+                <w:rFonts w:ascii="Arial" w:hAnsi="Arial" w:cs="Arial"/>
                 <w:b/>
                 <w:bCs/>
                 <w:kern w:val="0"/>
@@ -789,7 +816,7 @@
             </w:pPr>
             <w:r>
               <w:rPr>
-                <w:rFonts w:ascii="ArialMT" w:hAnsi="ArialMT" w:cs="ArialMT"/>
+                <w:rFonts w:ascii="Arial" w:hAnsi="Arial" w:cs="Arial"/>
                 <w:b/>
                 <w:bCs/>
                 <w:kern w:val="0"/>
@@ -821,7 +848,7 @@
             </w:pPr>
             <w:r>
               <w:rPr>
-                <w:rFonts w:ascii="ArialMT" w:hAnsi="ArialMT" w:cs="ArialMT"/>
+                <w:rFonts w:ascii="Arial" w:hAnsi="Arial" w:cs="Arial"/>
                 <w:b/>
                 <w:bCs/>
                 <w:kern w:val="0"/>
@@ -839,9 +866,14 @@
             <w:tcW w:w="1291" w:type="dxa"/>
           </w:tcPr>
           <w:p>
-            <w:r/>
-            <w:r>
-              <w:rPr>
+            <w:r>
+              <w:rPr>
+                <w:rFonts w:ascii="Arial" w:hAnsi="Arial" w:cs="Arial"/>
+              </w:rPr>
+            </w:r>
+            <w:r>
+              <w:rPr>
+                <w:rFonts w:ascii="Arial" w:hAnsi="Arial" w:cs="Arial"/>
                 <w:b w:val="0"/>
                 <w:sz w:val="18"/>
               </w:rPr>
@@ -854,9 +886,14 @@
             <w:tcW w:w="5429" w:type="dxa"/>
           </w:tcPr>
           <w:p>
-            <w:r/>
-            <w:r>
-              <w:rPr>
+            <w:r>
+              <w:rPr>
+                <w:rFonts w:ascii="Arial" w:hAnsi="Arial" w:cs="Arial"/>
+              </w:rPr>
+            </w:r>
+            <w:r>
+              <w:rPr>
+                <w:rFonts w:ascii="Arial" w:hAnsi="Arial" w:cs="Arial"/>
                 <w:b w:val="0"/>
                 <w:sz w:val="18"/>
               </w:rPr>
@@ -868,9 +905,14 @@
             <w:tcW w:w="1228" w:type="dxa"/>
           </w:tcPr>
           <w:p>
-            <w:r/>
-            <w:r>
-              <w:rPr>
+            <w:r>
+              <w:rPr>
+                <w:rFonts w:ascii="Arial" w:hAnsi="Arial" w:cs="Arial"/>
+              </w:rPr>
+            </w:r>
+            <w:r>
+              <w:rPr>
+                <w:rFonts w:ascii="Arial" w:hAnsi="Arial" w:cs="Arial"/>
                 <w:b w:val="0"/>
                 <w:sz w:val="18"/>
               </w:rPr>
@@ -882,9 +924,14 @@
             <w:tcW w:w="1680" w:type="dxa"/>
           </w:tcPr>
           <w:p>
-            <w:r/>
-            <w:r>
-              <w:rPr>
+            <w:r>
+              <w:rPr>
+                <w:rFonts w:ascii="Arial" w:hAnsi="Arial" w:cs="Arial"/>
+              </w:rPr>
+            </w:r>
+            <w:r>
+              <w:rPr>
+                <w:rFonts w:ascii="Arial" w:hAnsi="Arial" w:cs="Arial"/>
                 <w:b w:val="0"/>
                 <w:sz w:val="18"/>
               </w:rPr>
@@ -898,9 +945,14 @@
             <w:tcW w:w="1291" w:type="dxa"/>
           </w:tcPr>
           <w:p>
-            <w:r/>
-            <w:r>
-              <w:rPr>
+            <w:r>
+              <w:rPr>
+                <w:rFonts w:ascii="Arial" w:hAnsi="Arial" w:cs="Arial"/>
+              </w:rPr>
+            </w:r>
+            <w:r>
+              <w:rPr>
+                <w:rFonts w:ascii="Arial" w:hAnsi="Arial" w:cs="Arial"/>
                 <w:b w:val="0"/>
                 <w:sz w:val="18"/>
               </w:rPr>
@@ -913,9 +965,14 @@
             <w:tcW w:w="5429" w:type="dxa"/>
           </w:tcPr>
           <w:p>
-            <w:r/>
-            <w:r>
-              <w:rPr>
+            <w:r>
+              <w:rPr>
+                <w:rFonts w:ascii="Arial" w:hAnsi="Arial" w:cs="Arial"/>
+              </w:rPr>
+            </w:r>
+            <w:r>
+              <w:rPr>
+                <w:rFonts w:ascii="Arial" w:hAnsi="Arial" w:cs="Arial"/>
                 <w:b w:val="0"/>
                 <w:sz w:val="18"/>
               </w:rPr>
@@ -928,9 +985,14 @@
             <w:tcW w:w="1228" w:type="dxa"/>
           </w:tcPr>
           <w:p>
-            <w:r/>
-            <w:r>
-              <w:rPr>
+            <w:r>
+              <w:rPr>
+                <w:rFonts w:ascii="Arial" w:hAnsi="Arial" w:cs="Arial"/>
+              </w:rPr>
+            </w:r>
+            <w:r>
+              <w:rPr>
+                <w:rFonts w:ascii="Arial" w:hAnsi="Arial" w:cs="Arial"/>
                 <w:b w:val="0"/>
                 <w:sz w:val="18"/>
               </w:rPr>
@@ -943,9 +1005,14 @@
             <w:tcW w:w="1680" w:type="dxa"/>
           </w:tcPr>
           <w:p>
-            <w:r/>
-            <w:r>
-              <w:rPr>
+            <w:r>
+              <w:rPr>
+                <w:rFonts w:ascii="Arial" w:hAnsi="Arial" w:cs="Arial"/>
+              </w:rPr>
+            </w:r>
+            <w:r>
+              <w:rPr>
+                <w:rFonts w:ascii="Arial" w:hAnsi="Arial" w:cs="Arial"/>
                 <w:b w:val="0"/>
                 <w:sz w:val="18"/>
               </w:rPr>
@@ -960,9 +1027,14 @@
             <w:tcW w:w="1291" w:type="dxa"/>
           </w:tcPr>
           <w:p>
-            <w:r/>
-            <w:r>
-              <w:rPr>
+            <w:r>
+              <w:rPr>
+                <w:rFonts w:ascii="Arial" w:hAnsi="Arial" w:cs="Arial"/>
+              </w:rPr>
+            </w:r>
+            <w:r>
+              <w:rPr>
+                <w:rFonts w:ascii="Arial" w:hAnsi="Arial" w:cs="Arial"/>
                 <w:b w:val="0"/>
                 <w:sz w:val="18"/>
               </w:rPr>
@@ -975,9 +1047,14 @@
             <w:tcW w:w="5429" w:type="dxa"/>
           </w:tcPr>
           <w:p>
-            <w:r/>
-            <w:r>
-              <w:rPr>
+            <w:r>
+              <w:rPr>
+                <w:rFonts w:ascii="Arial" w:hAnsi="Arial" w:cs="Arial"/>
+              </w:rPr>
+            </w:r>
+            <w:r>
+              <w:rPr>
+                <w:rFonts w:ascii="Arial" w:hAnsi="Arial" w:cs="Arial"/>
                 <w:b w:val="0"/>
                 <w:sz w:val="18"/>
               </w:rPr>
@@ -989,9 +1066,14 @@
             <w:tcW w:w="1228" w:type="dxa"/>
           </w:tcPr>
           <w:p>
-            <w:r/>
-            <w:r>
-              <w:rPr>
+            <w:r>
+              <w:rPr>
+                <w:rFonts w:ascii="Arial" w:hAnsi="Arial" w:cs="Arial"/>
+              </w:rPr>
+            </w:r>
+            <w:r>
+              <w:rPr>
+                <w:rFonts w:ascii="Arial" w:hAnsi="Arial" w:cs="Arial"/>
                 <w:b w:val="0"/>
                 <w:sz w:val="18"/>
               </w:rPr>
@@ -1003,9 +1085,14 @@
             <w:tcW w:w="1680" w:type="dxa"/>
           </w:tcPr>
           <w:p>
-            <w:r/>
-            <w:r>
-              <w:rPr>
+            <w:r>
+              <w:rPr>
+                <w:rFonts w:ascii="Arial" w:hAnsi="Arial" w:cs="Arial"/>
+              </w:rPr>
+            </w:r>
+            <w:r>
+              <w:rPr>
+                <w:rFonts w:ascii="Arial" w:hAnsi="Arial" w:cs="Arial"/>
                 <w:b w:val="0"/>
                 <w:sz w:val="18"/>
               </w:rPr>
@@ -1058,7 +1145,7 @@
             </w:pPr>
             <w:r>
               <w:rPr>
-                <w:rFonts w:ascii="ArialMT" w:hAnsi="ArialMT" w:cs="ArialMT"/>
+                <w:rFonts w:ascii="Arial" w:hAnsi="Arial" w:cs="Arial"/>
                 <w:b/>
                 <w:bCs/>
                 <w:kern w:val="0"/>
@@ -1090,6 +1177,7 @@
             </w:pPr>
             <w:r>
               <w:rPr>
+                <w:rFonts w:ascii="Arial" w:hAnsi="Arial" w:cs="Arial"/>
                 <w:b/>
                 <w:bCs/>
               </w:rPr>
@@ -1143,7 +1231,7 @@
             </w:pPr>
             <w:r>
               <w:rPr>
-                <w:rFonts w:ascii="ArialMT" w:hAnsi="ArialMT" w:cs="ArialMT"/>
+                <w:rFonts w:ascii="Arial" w:hAnsi="Arial" w:cs="Arial"/>
                 <w:b/>
                 <w:bCs/>
                 <w:kern w:val="0"/>
@@ -1175,6 +1263,7 @@
             </w:pPr>
             <w:r>
               <w:rPr>
+                <w:rFonts w:ascii="Arial" w:hAnsi="Arial" w:cs="Arial"/>
                 <w:b/>
                 <w:bCs/>
               </w:rPr>
@@ -1228,7 +1317,7 @@
             </w:pPr>
             <w:r>
               <w:rPr>
-                <w:rFonts w:ascii="ArialMT" w:hAnsi="ArialMT" w:cs="ArialMT"/>
+                <w:rFonts w:ascii="Arial" w:hAnsi="Arial" w:cs="Arial"/>
                 <w:b/>
                 <w:bCs/>
                 <w:kern w:val="0"/>
@@ -1260,6 +1349,7 @@
             </w:pPr>
             <w:r>
               <w:rPr>
+                <w:rFonts w:ascii="Arial" w:hAnsi="Arial" w:cs="Arial"/>
                 <w:b/>
                 <w:bCs/>
               </w:rPr>
@@ -1298,6 +1388,7 @@
       </w:pPr>
       <w:r>
         <w:rPr>
+          <w:rFonts w:ascii="Arial" w:hAnsi="Arial" w:cs="Arial"/>
           <w:b/>
           <w:bCs/>
           <w:sz w:val="20"/>
@@ -1307,6 +1398,7 @@
       </w:r>
       <w:r>
         <w:rPr>
+          <w:rFonts w:ascii="Arial" w:hAnsi="Arial" w:cs="Arial"/>
           <w:sz w:val="20"/>
           <w:szCs w:val="20"/>
         </w:rPr>
@@ -1326,7 +1418,7 @@
       </w:pPr>
       <w:r>
         <w:rPr>
-          <w:rFonts w:eastAsia="Calibri" w:cstheme="minorHAnsi"/>
+          <w:rFonts w:eastAsia="Calibri" w:cstheme="minorHAnsi" w:ascii="Arial" w:hAnsi="Arial" w:cs="Arial"/>
           <w:b/>
           <w:bCs/>
           <w:sz w:val="20"/>
@@ -1336,7 +1428,7 @@
       </w:r>
       <w:r>
         <w:rPr>
-          <w:rFonts w:eastAsia="Calibri" w:cstheme="minorHAnsi"/>
+          <w:rFonts w:eastAsia="Calibri" w:cstheme="minorHAnsi" w:ascii="Arial" w:hAnsi="Arial" w:cs="Arial"/>
           <w:sz w:val="20"/>
           <w:szCs w:val="20"/>
         </w:rPr>
@@ -1356,7 +1448,7 @@
       </w:pPr>
       <w:r>
         <w:rPr>
-          <w:rFonts w:eastAsia="Calibri" w:cstheme="minorHAnsi"/>
+          <w:rFonts w:eastAsia="Calibri" w:cstheme="minorHAnsi" w:ascii="Arial" w:hAnsi="Arial" w:cs="Arial"/>
           <w:b/>
           <w:bCs/>
           <w:sz w:val="20"/>
@@ -1366,7 +1458,7 @@
       </w:r>
       <w:r>
         <w:rPr>
-          <w:rFonts w:eastAsia="Calibri" w:cstheme="minorHAnsi"/>
+          <w:rFonts w:eastAsia="Calibri" w:cstheme="minorHAnsi" w:ascii="Arial" w:hAnsi="Arial" w:cs="Arial"/>
           <w:sz w:val="20"/>
           <w:szCs w:val="20"/>
         </w:rPr>
@@ -1376,13 +1468,15 @@
     <w:p>
       <w:pPr>
         <w:spacing w:after="0" w:line="240" w:lineRule="auto"/>
-        <w:rPr>
-          <w:sz w:val="20"/>
-          <w:szCs w:val="20"/>
-        </w:rPr>
-      </w:pPr>
-      <w:r>
-        <w:rPr>
+        <w:jc w:val="both"/>
+        <w:rPr>
+          <w:sz w:val="20"/>
+          <w:szCs w:val="20"/>
+        </w:rPr>
+      </w:pPr>
+      <w:r>
+        <w:rPr>
+          <w:rFonts w:ascii="Arial" w:hAnsi="Arial" w:cs="Arial"/>
           <w:b/>
           <w:bCs/>
           <w:sz w:val="20"/>
@@ -1392,6 +1486,7 @@
       </w:r>
       <w:r>
         <w:rPr>
+          <w:rFonts w:ascii="Arial" w:hAnsi="Arial" w:cs="Arial"/>
           <w:sz w:val="20"/>
           <w:szCs w:val="20"/>
         </w:rPr>
@@ -1399,7 +1494,7 @@
       </w:r>
       <w:r>
         <w:rPr>
-          <w:rFonts w:ascii="Calibri" w:hAnsi="Calibri" w:cs="Calibri"/>
+          <w:rFonts w:ascii="Arial" w:hAnsi="Arial" w:cs="Arial"/>
           <w:sz w:val="20"/>
           <w:szCs w:val="20"/>
         </w:rPr>
@@ -1407,7 +1502,7 @@
       </w:r>
       <w:r>
         <w:rPr>
-          <w:rFonts w:eastAsia="Calibri" w:cstheme="minorHAnsi"/>
+          <w:rFonts w:eastAsia="Calibri" w:cstheme="minorHAnsi" w:ascii="Arial" w:hAnsi="Arial" w:cs="Arial"/>
           <w:sz w:val="20"/>
           <w:szCs w:val="20"/>
         </w:rPr>
@@ -1415,6 +1510,7 @@
       </w:r>
       <w:r>
         <w:rPr>
+          <w:rFonts w:ascii="Arial" w:hAnsi="Arial" w:cs="Arial"/>
           <w:sz w:val="20"/>
           <w:szCs w:val="20"/>
         </w:rPr>
@@ -1422,6 +1518,7 @@
       </w:r>
       <w:r>
         <w:rPr>
+          <w:rFonts w:ascii="Arial" w:hAnsi="Arial" w:cs="Arial"/>
           <w:b/>
           <w:bCs/>
           <w:sz w:val="20"/>
@@ -1431,6 +1528,7 @@
       </w:r>
       <w:r>
         <w:rPr>
+          <w:rFonts w:ascii="Arial" w:hAnsi="Arial" w:cs="Arial"/>
           <w:sz w:val="20"/>
           <w:szCs w:val="20"/>
         </w:rPr>
@@ -1438,6 +1536,7 @@
       </w:r>
       <w:r>
         <w:rPr>
+          <w:rFonts w:ascii="Arial" w:hAnsi="Arial" w:cs="Arial"/>
           <w:b/>
           <w:bCs/>
           <w:noProof/>
@@ -1448,6 +1547,7 @@
       </w:r>
       <w:r>
         <w:rPr>
+          <w:rFonts w:ascii="Arial" w:hAnsi="Arial" w:cs="Arial"/>
           <w:sz w:val="20"/>
           <w:szCs w:val="20"/>
         </w:rPr>
@@ -1455,6 +1555,7 @@
       </w:r>
       <w:r>
         <w:rPr>
+          <w:rFonts w:ascii="Arial" w:hAnsi="Arial" w:cs="Arial"/>
           <w:noProof/>
           <w:sz w:val="20"/>
           <w:szCs w:val="20"/>
@@ -1465,6 +1566,7 @@
     <w:p>
       <w:pPr>
         <w:spacing w:after="0"/>
+        <w:jc w:val="both"/>
         <w:rPr>
           <w:noProof/>
           <w:sz w:val="20"/>
@@ -1473,6 +1575,7 @@
       </w:pPr>
       <w:r>
         <w:rPr>
+          <w:rFonts w:ascii="Arial" w:hAnsi="Arial" w:cs="Arial"/>
           <w:b/>
           <w:bCs/>
           <w:noProof/>
@@ -1483,6 +1586,7 @@
       </w:r>
       <w:r>
         <w:rPr>
+          <w:rFonts w:ascii="Arial" w:hAnsi="Arial" w:cs="Arial"/>
           <w:b/>
           <w:bCs/>
           <w:sz w:val="20"/>
@@ -1492,6 +1596,7 @@
       </w:r>
       <w:r>
         <w:rPr>
+          <w:rFonts w:ascii="Arial" w:hAnsi="Arial" w:cs="Arial"/>
           <w:b/>
           <w:bCs/>
           <w:noProof/>
@@ -1503,6 +1608,7 @@
       </w:r>
       <w:r>
         <w:rPr>
+          <w:rFonts w:ascii="Arial" w:hAnsi="Arial" w:cs="Arial"/>
           <w:sz w:val="20"/>
           <w:szCs w:val="20"/>
         </w:rPr>
@@ -1510,6 +1616,7 @@
       </w:r>
       <w:r>
         <w:rPr>
+          <w:rFonts w:ascii="Arial" w:hAnsi="Arial" w:cs="Arial"/>
           <w:noProof/>
           <w:sz w:val="20"/>
           <w:szCs w:val="20"/>
@@ -1518,6 +1625,7 @@
       </w:r>
       <w:r>
         <w:rPr>
+          <w:rFonts w:ascii="Arial" w:hAnsi="Arial" w:cs="Arial"/>
           <w:sz w:val="20"/>
           <w:szCs w:val="20"/>
         </w:rPr>
@@ -1525,6 +1633,7 @@
       </w:r>
       <w:r>
         <w:rPr>
+          <w:rFonts w:ascii="Arial" w:hAnsi="Arial" w:cs="Arial"/>
           <w:b/>
           <w:bCs/>
           <w:noProof/>
@@ -1535,6 +1644,7 @@
       </w:r>
       <w:r>
         <w:rPr>
+          <w:rFonts w:ascii="Arial" w:hAnsi="Arial" w:cs="Arial"/>
           <w:b/>
           <w:bCs/>
           <w:color w:val="538135" w:themeColor="accent6" w:themeShade="BF"/>
@@ -1545,6 +1655,7 @@
       </w:r>
       <w:r>
         <w:rPr>
+          <w:rFonts w:ascii="Arial" w:hAnsi="Arial" w:cs="Arial"/>
           <w:b/>
           <w:bCs/>
           <w:noProof/>
@@ -1556,6 +1667,7 @@
       </w:r>
       <w:r>
         <w:rPr>
+          <w:rFonts w:ascii="Arial" w:hAnsi="Arial" w:cs="Arial"/>
           <w:b/>
           <w:bCs/>
           <w:sz w:val="20"/>
@@ -1565,6 +1677,7 @@
       </w:r>
       <w:r>
         <w:rPr>
+          <w:rFonts w:ascii="Arial" w:hAnsi="Arial" w:cs="Arial"/>
           <w:noProof/>
           <w:sz w:val="20"/>
           <w:szCs w:val="20"/>
@@ -1574,6 +1687,9 @@
     </w:p>
     <w:p>
       <w:r>
+        <w:rPr>
+          <w:rFonts w:ascii="Arial" w:hAnsi="Arial" w:cs="Arial"/>
+        </w:rPr>
         <w:t>{%p if has_deposit %}</w:t>
       </w:r>
     </w:p>
@@ -1590,6 +1706,7 @@
       </w:pPr>
       <w:r>
         <w:rPr>
+          <w:rFonts w:ascii="Arial" w:hAnsi="Arial" w:cs="Arial"/>
           <w:b/>
           <w:bCs/>
           <w:noProof/>
@@ -1600,6 +1717,7 @@
       </w:r>
       <w:r>
         <w:rPr>
+          <w:rFonts w:ascii="Arial" w:hAnsi="Arial" w:cs="Arial"/>
           <w:noProof/>
           <w:sz w:val="20"/>
           <w:szCs w:val="20"/>
@@ -1609,6 +1727,9 @@
     </w:p>
     <w:p>
       <w:r>
+        <w:rPr>
+          <w:rFonts w:ascii="Arial" w:hAnsi="Arial" w:cs="Arial"/>
+        </w:rPr>
         <w:t>{%p endif %}</w:t>
       </w:r>
     </w:p>
@@ -1625,12 +1746,14 @@
       </w:pPr>
       <w:r>
         <w:rPr>
+          <w:rFonts w:ascii="Arial" w:hAnsi="Arial" w:cs="Arial"/>
           <w:b/>
         </w:rPr>
         <w:t>TERMINI DI CANCELLAZIONE</w:t>
       </w:r>
       <w:r>
         <w:rPr>
+          <w:rFonts w:ascii="Arial" w:hAnsi="Arial" w:cs="Arial"/>
           <w:b w:val="0"/>
         </w:rPr>
         <w:br/>
@@ -1651,6 +1774,7 @@
         <w:autoSpaceDE w:val="0"/>
         <w:autoSpaceDN w:val="0"/>
         <w:adjustRightInd w:val="0"/>
+        <w:jc w:val="both"/>
         <w:rPr>
           <w:b/>
           <w:bCs/>
@@ -1658,6 +1782,7 @@
       </w:pPr>
       <w:r>
         <w:rPr>
+          <w:rFonts w:ascii="Arial" w:hAnsi="Arial" w:cs="Arial"/>
           <w:sz w:val="20"/>
           <w:szCs w:val="20"/>
         </w:rPr>
@@ -1674,6 +1799,7 @@
       </w:r>
       <w:r>
         <w:rPr>
+          <w:rFonts w:ascii="Arial" w:hAnsi="Arial" w:cs="Arial"/>
           <w:b/>
           <w:bCs/>
         </w:rPr>
@@ -1692,6 +1818,7 @@
       </w:pPr>
       <w:r>
         <w:rPr>
+          <w:rFonts w:ascii="Arial" w:hAnsi="Arial" w:cs="Arial"/>
           <w:b/>
           <w:bCs/>
         </w:rPr>
@@ -1708,6 +1835,7 @@
       </w:r>
       <w:r>
         <w:rPr>
+          <w:rFonts w:ascii="Arial" w:hAnsi="Arial" w:cs="Arial"/>
           <w:sz w:val="20"/>
           <w:szCs w:val="20"/>
         </w:rPr>
@@ -3039,6 +3167,9 @@
   <w:style w:type="paragraph" w:default="1" w:styleId="Normal">
     <w:name w:val="Normal"/>
     <w:qFormat/>
+    <w:rPr>
+      <w:rFonts w:ascii="Arial" w:hAnsi="Arial"/>
+    </w:rPr>
   </w:style>
   <w:style w:type="character" w:default="1" w:styleId="DefaultParagraphFont">
     <w:name w:val="Default Paragraph Font"/>

</xml_diff>

<commit_message>
Domanda: font Arial uniforme 10pt, tabella dati sponsor 8pt (una riga), TERMINI giustificato, IBAN a sinistra, segnaposti in bold, firma sponsor/firmatario centrata a destra
</commit_message>
<xml_diff>
--- a/contracts/templates_pdf/template_domanda_ammissione_it.docx
+++ b/contracts/templates_pdf/template_domanda_ammissione_it.docx
@@ -57,6 +57,7 @@
                 <w:rFonts w:ascii="Arial" w:hAnsi="Arial" w:cs="Arial"/>
                 <w:b/>
                 <w:bCs/>
+                <w:sz w:val="16"/>
               </w:rPr>
               <w:t>AZIENDA</w:t>
             </w:r>
@@ -79,6 +80,7 @@
                 <w:rFonts w:ascii="Arial" w:hAnsi="Arial" w:cs="Arial"/>
                 <w:b/>
                 <w:bCs/>
+                <w:sz w:val="16"/>
               </w:rPr>
               <w:t>{{ sponsor.legal_name }}</w:t>
             </w:r>
@@ -103,6 +105,7 @@
                 <w:rFonts w:ascii="Arial" w:hAnsi="Arial" w:cs="Arial"/>
                 <w:b/>
                 <w:bCs/>
+                <w:sz w:val="16"/>
               </w:rPr>
               <w:t>REF. AZIENDA</w:t>
             </w:r>
@@ -125,6 +128,7 @@
                 <w:rFonts w:ascii="Arial" w:hAnsi="Arial" w:cs="Arial"/>
                 <w:b/>
                 <w:bCs/>
+                <w:sz w:val="16"/>
               </w:rPr>
               <w:t>{{ signer.full_name }}</w:t>
             </w:r>
@@ -149,6 +153,7 @@
                 <w:rFonts w:ascii="Arial" w:hAnsi="Arial" w:cs="Arial"/>
                 <w:b/>
                 <w:bCs/>
+                <w:sz w:val="16"/>
               </w:rPr>
               <w:t>INDIRIZZO</w:t>
             </w:r>
@@ -171,6 +176,7 @@
                 <w:rFonts w:ascii="Arial" w:hAnsi="Arial" w:cs="Arial"/>
                 <w:b/>
                 <w:bCs/>
+                <w:sz w:val="16"/>
               </w:rPr>
               <w:t>{{ sponsor.billing_street }}{% if sponsor.billing_street_number %} {{ sponsor.billing_street_number }}{% endif %}</w:t>
             </w:r>
@@ -192,6 +198,7 @@
                 <w:rFonts w:ascii="Arial" w:hAnsi="Arial" w:cs="Arial"/>
                 <w:b/>
                 <w:bCs/>
+                <w:sz w:val="16"/>
               </w:rPr>
               <w:t>CAP</w:t>
             </w:r>
@@ -213,6 +220,7 @@
                 <w:rFonts w:ascii="Arial" w:hAnsi="Arial" w:cs="Arial"/>
                 <w:b/>
                 <w:bCs/>
+                <w:sz w:val="16"/>
               </w:rPr>
               <w:t>{{ sponsor.billing_zip }}</w:t>
             </w:r>
@@ -237,6 +245,7 @@
                 <w:rFonts w:ascii="Arial" w:hAnsi="Arial" w:cs="Arial"/>
                 <w:b/>
                 <w:bCs/>
+                <w:sz w:val="16"/>
               </w:rPr>
               <w:t>CITTA’</w:t>
             </w:r>
@@ -260,6 +269,7 @@
                 <w:rFonts w:ascii="Arial" w:hAnsi="Arial" w:cs="Arial"/>
                 <w:b/>
                 <w:bCs/>
+                <w:sz w:val="16"/>
               </w:rPr>
               <w:t>{{ sponsor.billing_city }}</w:t>
             </w:r>
@@ -281,6 +291,7 @@
                 <w:rFonts w:ascii="Arial" w:hAnsi="Arial" w:cs="Arial"/>
                 <w:b/>
                 <w:bCs/>
+                <w:sz w:val="16"/>
               </w:rPr>
               <w:t>PROV</w:t>
             </w:r>
@@ -303,6 +314,7 @@
                 <w:rFonts w:ascii="Arial" w:hAnsi="Arial" w:cs="Arial"/>
                 <w:b/>
                 <w:bCs/>
+                <w:sz w:val="16"/>
               </w:rPr>
               <w:t>{{ sponsor.billing_province }}</w:t>
             </w:r>
@@ -327,6 +339,7 @@
                 <w:rFonts w:ascii="Arial" w:hAnsi="Arial" w:cs="Arial"/>
                 <w:b/>
                 <w:bCs/>
+                <w:sz w:val="16"/>
               </w:rPr>
               <w:t>TELEFONO</w:t>
             </w:r>
@@ -349,6 +362,7 @@
                 <w:rFonts w:ascii="Arial" w:hAnsi="Arial" w:cs="Arial"/>
                 <w:b/>
                 <w:bCs/>
+                <w:sz w:val="16"/>
               </w:rPr>
               <w:t>{{ signer.phone|default('________', true) }}</w:t>
             </w:r>
@@ -370,6 +384,7 @@
                 <w:rFonts w:ascii="Arial" w:hAnsi="Arial" w:cs="Arial"/>
                 <w:b/>
                 <w:bCs/>
+                <w:sz w:val="16"/>
               </w:rPr>
               <w:t>EMAIL referente</w:t>
             </w:r>
@@ -392,6 +407,7 @@
                 <w:rFonts w:ascii="Arial" w:hAnsi="Arial" w:cs="Arial"/>
                 <w:b/>
                 <w:bCs/>
+                <w:sz w:val="16"/>
               </w:rPr>
               <w:t>{{ signer.email|default('________', true) }}</w:t>
             </w:r>
@@ -416,6 +432,7 @@
                 <w:rFonts w:ascii="Arial" w:hAnsi="Arial" w:cs="Arial"/>
                 <w:b/>
                 <w:bCs/>
+                <w:sz w:val="16"/>
               </w:rPr>
               <w:t>PARTITA IVA</w:t>
             </w:r>
@@ -437,6 +454,7 @@
                 <w:rFonts w:ascii="Arial" w:hAnsi="Arial" w:cs="Arial"/>
                 <w:b/>
                 <w:bCs/>
+                <w:sz w:val="16"/>
               </w:rPr>
               <w:t>{{ sponsor.vat_number }}</w:t>
             </w:r>
@@ -458,6 +476,7 @@
                 <w:rFonts w:ascii="Arial" w:hAnsi="Arial" w:cs="Arial"/>
                 <w:b/>
                 <w:bCs/>
+                <w:sz w:val="16"/>
               </w:rPr>
               <w:t>COD. FISC.</w:t>
             </w:r>
@@ -480,6 +499,7 @@
                 <w:rFonts w:ascii="Arial" w:hAnsi="Arial" w:cs="Arial"/>
                 <w:b/>
                 <w:bCs/>
+                <w:sz w:val="16"/>
               </w:rPr>
               <w:t>{{ sponsor.tax_code }}</w:t>
             </w:r>
@@ -504,6 +524,7 @@
                 <w:rFonts w:ascii="Arial" w:hAnsi="Arial" w:cs="Arial"/>
                 <w:b/>
                 <w:bCs/>
+                <w:sz w:val="16"/>
               </w:rPr>
               <w:t>PEC</w:t>
             </w:r>
@@ -525,6 +546,7 @@
                 <w:rFonts w:ascii="Arial" w:hAnsi="Arial" w:cs="Arial"/>
                 <w:b/>
                 <w:bCs/>
+                <w:sz w:val="16"/>
               </w:rPr>
               <w:t>{{ sponsor.pec_email }}</w:t>
             </w:r>
@@ -546,6 +568,7 @@
                 <w:rFonts w:ascii="Arial" w:hAnsi="Arial" w:cs="Arial"/>
                 <w:b/>
                 <w:bCs/>
+                <w:sz w:val="16"/>
               </w:rPr>
               <w:t>COD. SDI.</w:t>
             </w:r>
@@ -568,6 +591,7 @@
                 <w:rFonts w:ascii="Arial" w:hAnsi="Arial" w:cs="Arial"/>
                 <w:b/>
                 <w:bCs/>
+                <w:sz w:val="16"/>
               </w:rPr>
               <w:t>{{ sponsor.sdi_code|default('________', true) }}</w:t>
             </w:r>
@@ -588,6 +612,7 @@
           <w:rFonts w:ascii="Arial" w:hAnsi="Arial" w:cs="Arial"/>
           <w:b/>
           <w:bCs/>
+          <w:sz w:val="20"/>
         </w:rPr>
         <w:t>Indicazione sommaria dei prodotti trattati dall’azienda</w:t>
       </w:r>
@@ -622,6 +647,7 @@
                 <w:rFonts w:ascii="Arial" w:hAnsi="Arial" w:cs="Arial"/>
                 <w:b/>
                 <w:bCs/>
+                <w:sz w:val="18"/>
               </w:rPr>
               <w:t>{{ sponsor.business_description }}</w:t>
             </w:r>
@@ -648,6 +674,7 @@
       <w:r>
         <w:rPr>
           <w:rFonts w:ascii="Arial" w:hAnsi="Arial" w:cs="Arial"/>
+          <w:b/>
           <w:kern w:val="0"/>
           <w:sz w:val="20"/>
           <w:szCs w:val="20"/>
@@ -756,7 +783,7 @@
                 <w:b/>
                 <w:bCs/>
                 <w:kern w:val="0"/>
-                <w:sz w:val="20"/>
+                <w:sz w:val="18"/>
                 <w:szCs w:val="20"/>
               </w:rPr>
               <w:t>q.tà</w:t>
@@ -788,7 +815,7 @@
                 <w:b/>
                 <w:bCs/>
                 <w:kern w:val="0"/>
-                <w:sz w:val="20"/>
+                <w:sz w:val="18"/>
                 <w:szCs w:val="20"/>
               </w:rPr>
               <w:t>Descrizione dei servizi richiesti</w:t>
@@ -820,7 +847,7 @@
                 <w:b/>
                 <w:bCs/>
                 <w:kern w:val="0"/>
-                <w:sz w:val="20"/>
+                <w:sz w:val="18"/>
                 <w:szCs w:val="20"/>
               </w:rPr>
               <w:t>Pr. Unit.</w:t>
@@ -852,7 +879,7 @@
                 <w:b/>
                 <w:bCs/>
                 <w:kern w:val="0"/>
-                <w:sz w:val="20"/>
+                <w:sz w:val="18"/>
                 <w:szCs w:val="20"/>
               </w:rPr>
               <w:t>Euro</w:t>
@@ -869,6 +896,7 @@
             <w:r>
               <w:rPr>
                 <w:rFonts w:ascii="Arial" w:hAnsi="Arial" w:cs="Arial"/>
+                <w:sz w:val="18"/>
               </w:rPr>
             </w:r>
             <w:r>
@@ -889,6 +917,7 @@
             <w:r>
               <w:rPr>
                 <w:rFonts w:ascii="Arial" w:hAnsi="Arial" w:cs="Arial"/>
+                <w:sz w:val="18"/>
               </w:rPr>
             </w:r>
             <w:r>
@@ -908,6 +937,7 @@
             <w:r>
               <w:rPr>
                 <w:rFonts w:ascii="Arial" w:hAnsi="Arial" w:cs="Arial"/>
+                <w:sz w:val="18"/>
               </w:rPr>
             </w:r>
             <w:r>
@@ -927,6 +957,7 @@
             <w:r>
               <w:rPr>
                 <w:rFonts w:ascii="Arial" w:hAnsi="Arial" w:cs="Arial"/>
+                <w:sz w:val="18"/>
               </w:rPr>
             </w:r>
             <w:r>
@@ -948,6 +979,101 @@
             <w:r>
               <w:rPr>
                 <w:rFonts w:ascii="Arial" w:hAnsi="Arial" w:cs="Arial"/>
+                <w:sz w:val="18"/>
+              </w:rPr>
+            </w:r>
+            <w:r>
+              <w:rPr>
+                <w:rFonts w:ascii="Arial" w:hAnsi="Arial" w:cs="Arial"/>
+                <w:b/>
+                <w:sz w:val="18"/>
+              </w:rPr>
+              <w:t>{{ ln.quantity }}</w:t>
+            </w:r>
+          </w:p>
+        </w:tc>
+        <w:tc>
+          <w:tcPr>
+            <w:tcW w:w="5429" w:type="dxa"/>
+          </w:tcPr>
+          <w:p>
+            <w:r>
+              <w:rPr>
+                <w:rFonts w:ascii="Arial" w:hAnsi="Arial" w:cs="Arial"/>
+                <w:sz w:val="18"/>
+              </w:rPr>
+            </w:r>
+            <w:r>
+              <w:rPr>
+                <w:rFonts w:ascii="Arial" w:hAnsi="Arial" w:cs="Arial"/>
+                <w:b/>
+                <w:sz w:val="18"/>
+              </w:rPr>
+              <w:t>{{ ln.service_name_snapshot }}{% if ln.variant_label_snapshot %} – {{ ln.variant_label_snapshot }}{% endif %}</w:t>
+            </w:r>
+            <w:r>
+              <w:rPr>
+                <w:rFonts w:ascii="Arial" w:hAnsi="Arial" w:cs="Arial"/>
+                <w:b/>
+                <w:sz w:val="18"/>
+              </w:rPr>
+              <w:t xml:space="preserve"> {% if ln.is_prezzo_revisionato %}(Listino € {{ ln.prezzo_listino|format_currency }} — Prezzo riservato € {{ ln.prezzo_riservato|format_currency }}){% endif %}</w:t>
+            </w:r>
+          </w:p>
+        </w:tc>
+        <w:tc>
+          <w:tcPr>
+            <w:tcW w:w="1228" w:type="dxa"/>
+          </w:tcPr>
+          <w:p>
+            <w:r>
+              <w:rPr>
+                <w:rFonts w:ascii="Arial" w:hAnsi="Arial" w:cs="Arial"/>
+                <w:sz w:val="18"/>
+              </w:rPr>
+            </w:r>
+            <w:r>
+              <w:rPr>
+                <w:rFonts w:ascii="Arial" w:hAnsi="Arial" w:cs="Arial"/>
+                <w:b/>
+                <w:sz w:val="18"/>
+              </w:rPr>
+              <w:t>€ {{ ln.unit_price|format_currency }}</w:t>
+            </w:r>
+          </w:p>
+        </w:tc>
+        <w:tc>
+          <w:tcPr>
+            <w:tcW w:w="1680" w:type="dxa"/>
+          </w:tcPr>
+          <w:p>
+            <w:r>
+              <w:rPr>
+                <w:rFonts w:ascii="Arial" w:hAnsi="Arial" w:cs="Arial"/>
+                <w:sz w:val="18"/>
+              </w:rPr>
+            </w:r>
+            <w:r>
+              <w:rPr>
+                <w:rFonts w:ascii="Arial" w:hAnsi="Arial" w:cs="Arial"/>
+                <w:b/>
+                <w:sz w:val="18"/>
+              </w:rPr>
+              <w:t>€ {{ ln.line_subtotal|format_currency }}</w:t>
+            </w:r>
+          </w:p>
+        </w:tc>
+      </w:tr>
+      <w:tr>
+        <w:tc>
+          <w:tcPr>
+            <w:tcW w:w="1291" w:type="dxa"/>
+          </w:tcPr>
+          <w:p>
+            <w:r>
+              <w:rPr>
+                <w:rFonts w:ascii="Arial" w:hAnsi="Arial" w:cs="Arial"/>
+                <w:sz w:val="18"/>
               </w:rPr>
             </w:r>
             <w:r>
@@ -956,7 +1082,7 @@
                 <w:b w:val="0"/>
                 <w:sz w:val="18"/>
               </w:rPr>
-              <w:t>{{ ln.quantity }}</w:t>
+              <w:t>{%tr endfor %}</w:t>
             </w:r>
           </w:p>
         </w:tc>
@@ -968,6 +1094,7 @@
             <w:r>
               <w:rPr>
                 <w:rFonts w:ascii="Arial" w:hAnsi="Arial" w:cs="Arial"/>
+                <w:sz w:val="18"/>
               </w:rPr>
             </w:r>
             <w:r>
@@ -976,10 +1103,6 @@
                 <w:b w:val="0"/>
                 <w:sz w:val="18"/>
               </w:rPr>
-              <w:t>{{ ln.service_name_snapshot }}{% if ln.variant_label_snapshot %} – {{ ln.variant_label_snapshot }}{% endif %}</w:t>
-            </w:r>
-            <w:r>
-              <w:t xml:space="preserve"> {% if ln.is_prezzo_revisionato %}(Listino € {{ ln.prezzo_listino|format_currency }} — Prezzo riservato € {{ ln.prezzo_riservato|format_currency }}){% endif %}</w:t>
             </w:r>
           </w:p>
         </w:tc>
@@ -991,6 +1114,7 @@
             <w:r>
               <w:rPr>
                 <w:rFonts w:ascii="Arial" w:hAnsi="Arial" w:cs="Arial"/>
+                <w:sz w:val="18"/>
               </w:rPr>
             </w:r>
             <w:r>
@@ -999,7 +1123,6 @@
                 <w:b w:val="0"/>
                 <w:sz w:val="18"/>
               </w:rPr>
-              <w:t>€ {{ ln.unit_price|format_currency }}</w:t>
             </w:r>
           </w:p>
         </w:tc>
@@ -1011,86 +1134,7 @@
             <w:r>
               <w:rPr>
                 <w:rFonts w:ascii="Arial" w:hAnsi="Arial" w:cs="Arial"/>
-              </w:rPr>
-            </w:r>
-            <w:r>
-              <w:rPr>
-                <w:rFonts w:ascii="Arial" w:hAnsi="Arial" w:cs="Arial"/>
-                <w:b w:val="0"/>
                 <w:sz w:val="18"/>
-              </w:rPr>
-              <w:t>€ {{ ln.line_subtotal|format_currency }}</w:t>
-            </w:r>
-          </w:p>
-        </w:tc>
-      </w:tr>
-      <w:tr>
-        <w:tc>
-          <w:tcPr>
-            <w:tcW w:w="1291" w:type="dxa"/>
-          </w:tcPr>
-          <w:p>
-            <w:r>
-              <w:rPr>
-                <w:rFonts w:ascii="Arial" w:hAnsi="Arial" w:cs="Arial"/>
-              </w:rPr>
-            </w:r>
-            <w:r>
-              <w:rPr>
-                <w:rFonts w:ascii="Arial" w:hAnsi="Arial" w:cs="Arial"/>
-                <w:b w:val="0"/>
-                <w:sz w:val="18"/>
-              </w:rPr>
-              <w:t>{%tr endfor %}</w:t>
-            </w:r>
-          </w:p>
-        </w:tc>
-        <w:tc>
-          <w:tcPr>
-            <w:tcW w:w="5429" w:type="dxa"/>
-          </w:tcPr>
-          <w:p>
-            <w:r>
-              <w:rPr>
-                <w:rFonts w:ascii="Arial" w:hAnsi="Arial" w:cs="Arial"/>
-              </w:rPr>
-            </w:r>
-            <w:r>
-              <w:rPr>
-                <w:rFonts w:ascii="Arial" w:hAnsi="Arial" w:cs="Arial"/>
-                <w:b w:val="0"/>
-                <w:sz w:val="18"/>
-              </w:rPr>
-            </w:r>
-          </w:p>
-        </w:tc>
-        <w:tc>
-          <w:tcPr>
-            <w:tcW w:w="1228" w:type="dxa"/>
-          </w:tcPr>
-          <w:p>
-            <w:r>
-              <w:rPr>
-                <w:rFonts w:ascii="Arial" w:hAnsi="Arial" w:cs="Arial"/>
-              </w:rPr>
-            </w:r>
-            <w:r>
-              <w:rPr>
-                <w:rFonts w:ascii="Arial" w:hAnsi="Arial" w:cs="Arial"/>
-                <w:b w:val="0"/>
-                <w:sz w:val="18"/>
-              </w:rPr>
-            </w:r>
-          </w:p>
-        </w:tc>
-        <w:tc>
-          <w:tcPr>
-            <w:tcW w:w="1680" w:type="dxa"/>
-          </w:tcPr>
-          <w:p>
-            <w:r>
-              <w:rPr>
-                <w:rFonts w:ascii="Arial" w:hAnsi="Arial" w:cs="Arial"/>
               </w:rPr>
             </w:r>
             <w:r>
@@ -1152,7 +1196,7 @@
                 <w:b/>
                 <w:bCs/>
                 <w:kern w:val="0"/>
-                <w:sz w:val="20"/>
+                <w:sz w:val="18"/>
                 <w:szCs w:val="20"/>
               </w:rPr>
               <w:t>TOTALE IMPONIBILE</w:t>
@@ -1183,6 +1227,7 @@
                 <w:rFonts w:ascii="Arial" w:hAnsi="Arial" w:cs="Arial"/>
                 <w:b/>
                 <w:bCs/>
+                <w:sz w:val="18"/>
               </w:rPr>
               <w:t>{{ imponibile }}</w:t>
             </w:r>
@@ -1238,7 +1283,7 @@
                 <w:b/>
                 <w:bCs/>
                 <w:kern w:val="0"/>
-                <w:sz w:val="20"/>
+                <w:sz w:val="18"/>
                 <w:szCs w:val="20"/>
               </w:rPr>
               <w:t>IVA 22%</w:t>
@@ -1269,6 +1314,7 @@
                 <w:rFonts w:ascii="Arial" w:hAnsi="Arial" w:cs="Arial"/>
                 <w:b/>
                 <w:bCs/>
+                <w:sz w:val="18"/>
               </w:rPr>
               <w:t>{{ iva }}</w:t>
             </w:r>
@@ -1324,7 +1370,7 @@
                 <w:b/>
                 <w:bCs/>
                 <w:kern w:val="0"/>
-                <w:sz w:val="20"/>
+                <w:sz w:val="18"/>
                 <w:szCs w:val="20"/>
               </w:rPr>
               <w:t>TOTALE</w:t>
@@ -1355,6 +1401,7 @@
                 <w:rFonts w:ascii="Arial" w:hAnsi="Arial" w:cs="Arial"/>
                 <w:b/>
                 <w:bCs/>
+                <w:sz w:val="18"/>
               </w:rPr>
               <w:t>{{ totale }}</w:t>
             </w:r>
@@ -1471,7 +1518,7 @@
     <w:p>
       <w:pPr>
         <w:spacing w:after="0" w:line="240" w:lineRule="auto"/>
-        <w:jc w:val="both"/>
+        <w:jc w:val="left"/>
         <w:rPr>
           <w:sz w:val="20"/>
           <w:szCs w:val="20"/>
@@ -1532,6 +1579,7 @@
       <w:r>
         <w:rPr>
           <w:rFonts w:ascii="Arial" w:hAnsi="Arial" w:cs="Arial"/>
+          <w:b/>
           <w:sz w:val="20"/>
           <w:szCs w:val="20"/>
         </w:rPr>
@@ -1620,6 +1668,7 @@
       <w:r>
         <w:rPr>
           <w:rFonts w:ascii="Arial" w:hAnsi="Arial" w:cs="Arial"/>
+          <w:b/>
           <w:noProof/>
           <w:sz w:val="20"/>
           <w:szCs w:val="20"/>
@@ -1681,6 +1730,7 @@
       <w:r>
         <w:rPr>
           <w:rFonts w:ascii="Arial" w:hAnsi="Arial" w:cs="Arial"/>
+          <w:b/>
           <w:noProof/>
           <w:sz w:val="20"/>
           <w:szCs w:val="20"/>
@@ -1692,6 +1742,7 @@
       <w:r>
         <w:rPr>
           <w:rFonts w:ascii="Arial" w:hAnsi="Arial" w:cs="Arial"/>
+          <w:sz w:val="20"/>
         </w:rPr>
         <w:t>{%p if has_deposit %}</w:t>
       </w:r>
@@ -1732,6 +1783,7 @@
       <w:r>
         <w:rPr>
           <w:rFonts w:ascii="Arial" w:hAnsi="Arial" w:cs="Arial"/>
+          <w:sz w:val="20"/>
         </w:rPr>
         <w:t>{%p endif %}</w:t>
       </w:r>
@@ -1740,7 +1792,7 @@
       <w:pPr>
         <w:adjustRightInd w:val="0"/>
         <w:spacing w:after="0" w:line="240" w:lineRule="auto"/>
-        <w:jc w:val="left"/>
+        <w:jc w:val="both"/>
         <w:rPr>
           <w:noProof/>
           <w:sz w:val="20"/>
@@ -1751,13 +1803,15 @@
         <w:rPr>
           <w:rFonts w:ascii="Arial" w:hAnsi="Arial" w:cs="Arial"/>
           <w:b/>
+          <w:sz w:val="20"/>
         </w:rPr>
         <w:t>TERMINI DI CANCELLAZIONE</w:t>
       </w:r>
       <w:r>
         <w:rPr>
           <w:rFonts w:ascii="Arial" w:hAnsi="Arial" w:cs="Arial"/>
-          <w:b w:val="0"/>
+          <w:b/>
+          <w:sz w:val="20"/>
         </w:rPr>
         <w:br/>
         <w:t>La rinuncia (e/o le variazioni e/o le cancellazioni totali e/o parziali della prenotazione) dell'Espositore a partecipare alla Manifestazione, per qualsiasi motivo, dovrà essere comunicata a mezzo di lettera raccomandata A/R o PEC indirizzata all'Organizzatore almeno 30 giorni prima dell'inizio della Manifestazione. {% if has_deposit %}In tal caso l'Organizzatore ha diritto di trattenere, a titolo di penale, una somma pari al {{ penale_percent }}% dell'importo totale del presente contratto (corrispondente al deposito cauzionale/caparra).{% else %}In tal caso l'Organizzatore ha diritto ad ottenere, a titolo di penale, una somma pari al {{ penale_percent }}% dell'importo totale del presente contratto, entro e non oltre 10 giorni dalla data di annullamento.{% endif %} Nel caso in cui la rinuncia pervenga successivamente al 30° giorno antecedente l'inizio della Manifestazione l'Espositore sarà tenuto al pagamento integrale del corrispettivo del presente contratto.</w:t>
@@ -1777,7 +1831,7 @@
         <w:autoSpaceDE w:val="0"/>
         <w:autoSpaceDN w:val="0"/>
         <w:adjustRightInd w:val="0"/>
-        <w:jc w:val="both"/>
+        <w:jc w:val="left"/>
         <w:rPr>
           <w:b/>
           <w:bCs/>
@@ -1786,25 +1840,22 @@
       <w:r>
         <w:rPr>
           <w:rFonts w:ascii="Arial" w:hAnsi="Arial" w:cs="Arial"/>
-          <w:sz w:val="20"/>
-          <w:szCs w:val="20"/>
+          <w:b w:val="0"/>
+          <w:sz w:val="20"/>
         </w:rPr>
         <w:t>Bologna, {{ contract.signed_date|format_date|default('___________', true) }}</w:t>
-        <w:tab/>
-        <w:tab/>
-        <w:tab/>
-        <w:tab/>
-        <w:tab/>
-        <w:tab/>
-        <w:tab/>
-        <w:tab/>
-        <w:tab/>
-      </w:r>
+      </w:r>
+    </w:p>
+    <w:p>
+      <w:pPr>
+        <w:ind w:left="5102"/>
+        <w:jc w:val="center"/>
+      </w:pPr>
       <w:r>
         <w:rPr>
           <w:rFonts w:ascii="Arial" w:hAnsi="Arial" w:cs="Arial"/>
           <w:b/>
-          <w:bCs/>
+          <w:sz w:val="20"/>
         </w:rPr>
         <w:t>{{ sponsor.legal_name }}</w:t>
       </w:r>
@@ -1814,6 +1865,8 @@
         <w:autoSpaceDE w:val="0"/>
         <w:autoSpaceDN w:val="0"/>
         <w:adjustRightInd w:val="0"/>
+        <w:ind w:left="5102"/>
+        <w:jc w:val="center"/>
         <w:rPr>
           <w:sz w:val="20"/>
           <w:szCs w:val="20"/>
@@ -1823,30 +1876,9 @@
         <w:rPr>
           <w:rFonts w:ascii="Arial" w:hAnsi="Arial" w:cs="Arial"/>
           <w:b/>
-          <w:bCs/>
-        </w:rPr>
-        <w:tab/>
-        <w:tab/>
-        <w:tab/>
-        <w:tab/>
-        <w:tab/>
-        <w:tab/>
-        <w:tab/>
-        <w:tab/>
-        <w:tab/>
-        <w:t xml:space="preserve">       {{ signer.full_name }}</w:t>
-      </w:r>
-      <w:r>
-        <w:rPr>
-          <w:rFonts w:ascii="Arial" w:hAnsi="Arial" w:cs="Arial"/>
-          <w:sz w:val="20"/>
-          <w:szCs w:val="20"/>
-        </w:rPr>
-        <w:tab/>
-        <w:tab/>
-        <w:tab/>
-        <w:tab/>
-        <w:tab/>
+          <w:sz w:val="20"/>
+        </w:rPr>
+        <w:t>{{ signer.full_name }}</w:t>
       </w:r>
     </w:p>
     <w:sectPr>
@@ -3172,6 +3204,7 @@
     <w:qFormat/>
     <w:rPr>
       <w:rFonts w:ascii="Arial" w:hAnsi="Arial"/>
+      <w:sz w:val="20"/>
     </w:rPr>
   </w:style>
   <w:style w:type="character" w:default="1" w:styleId="DefaultParagraphFont">

</xml_diff>

<commit_message>
Sconto: importo dentro il badge (SCONTO/PREZZO RISERVATO EUR X) su preventivo, scheda portale e domanda; listino in colonna prezzo, finale in totale
</commit_message>
<xml_diff>
--- a/contracts/templates_pdf/template_domanda_ammissione_it.docx
+++ b/contracts/templates_pdf/template_domanda_ammissione_it.docx
@@ -1035,9 +1035,11 @@
               <w:rPr>
                 <w:rFonts w:ascii="Arial" w:hAnsi="Arial" w:cs="Arial"/>
                 <w:b/>
+                <w:color w:val="2E7D32"/>
                 <w:sz w:val="18"/>
               </w:rPr>
-              <w:t xml:space="preserve"> {% if ln.is_prezzo_revisionato %}(Listino € {{ ln.prezzo_listino|format_currency }} — Prezzo riservato € {{ ln.prezzo_riservato|format_currency }}){% endif %}</w:t>
+              <w:br/>
+              <w:t>{% if ln.is_prezzo_revisionato %}{% if ln.is_sconto_esplicito %}SCONTO RISERVATO € {{ ln.sconto_eur|format_currency }}{% else %}PREZZO RISERVATO € {{ ln.prezzo_riservato|format_currency }}{% endif %}{% endif %}</w:t>
             </w:r>
           </w:p>
         </w:tc>
@@ -1058,7 +1060,7 @@
                 <w:b/>
                 <w:sz w:val="18"/>
               </w:rPr>
-              <w:t>€ {{ ln.unit_price|format_currency }}</w:t>
+              <w:t>€ {{ ln.prezzo_listino_unit|format_currency }}</w:t>
             </w:r>
           </w:p>
         </w:tc>

</xml_diff>